<commit_message>
Add unit tests for A() function
</commit_message>
<xml_diff>
--- a/АП_РІ-11_Слободянюк_ЛР-04.5.docx
+++ b/АП_РІ-11_Слободянюк_ЛР-04.5.docx
@@ -206,11 +206,6 @@
     <w:p/>
     <w:p/>
     <w:p>
-      <w:pPr>
-        <w:rPr>
-          <w:lang w:val="en-US"/>
-        </w:rPr>
-      </w:pPr>
       <w:r>
         <w:t xml:space="preserve">Блок-схема алгоритму: </w:t>
       </w:r>
@@ -227,10 +222,10 @@
           <w:lang w:val="ru-RU" w:eastAsia="ru-RU"/>
         </w:rPr>
         <w:drawing>
-          <wp:inline distT="0" distB="0" distL="0" distR="0" wp14:anchorId="3C830C07" wp14:editId="58CB5EA1">
-            <wp:extent cx="5753100" cy="6979262"/>
+          <wp:inline distT="0" distB="0" distL="0" distR="0" wp14:anchorId="1884F7E6" wp14:editId="1DF2D3BB">
+            <wp:extent cx="6480175" cy="7607300"/>
             <wp:effectExtent l="0" t="0" r="0" b="0"/>
-            <wp:docPr id="1228377040" name="Рисунок 1" descr="Зображення, що містить знімок екрана, схема, текст, астрономія&#10;&#10;Вміст на основі ШІ може бути неправильним."/>
+            <wp:docPr id="1664442214" name="Рисунок 1" descr="Зображення, що містить знімок екрана, Симетрія, Графіка, дизайн&#10;&#10;Вміст на основі ШІ може бути неправильним."/>
             <wp:cNvGraphicFramePr>
               <a:graphicFrameLocks xmlns:a="http://schemas.openxmlformats.org/drawingml/2006/main" noChangeAspect="1"/>
             </wp:cNvGraphicFramePr>
@@ -238,11 +233,17 @@
               <a:graphicData uri="http://schemas.openxmlformats.org/drawingml/2006/picture">
                 <pic:pic xmlns:pic="http://schemas.openxmlformats.org/drawingml/2006/picture">
                   <pic:nvPicPr>
-                    <pic:cNvPr id="1228377040" name="Рисунок 1" descr="Зображення, що містить знімок екрана, схема, текст, астрономія&#10;&#10;Вміст на основі ШІ може бути неправильним."/>
+                    <pic:cNvPr id="1664442214" name="Рисунок 1" descr="Зображення, що містить знімок екрана, Симетрія, Графіка, дизайн&#10;&#10;Вміст на основі ШІ може бути неправильним."/>
                     <pic:cNvPicPr/>
                   </pic:nvPicPr>
                   <pic:blipFill>
-                    <a:blip r:embed="rId6"/>
+                    <a:blip r:embed="rId6">
+                      <a:extLst>
+                        <a:ext uri="{28A0092B-C50C-407E-A947-70E740481C1C}">
+                          <a14:useLocalDpi xmlns:a14="http://schemas.microsoft.com/office/drawing/2010/main" val="0"/>
+                        </a:ext>
+                      </a:extLst>
+                    </a:blip>
                     <a:stretch>
                       <a:fillRect/>
                     </a:stretch>
@@ -250,7 +251,7 @@
                   <pic:spPr>
                     <a:xfrm>
                       <a:off x="0" y="0"/>
-                      <a:ext cx="5755920" cy="6982683"/>
+                      <a:ext cx="6480175" cy="7607300"/>
                     </a:xfrm>
                     <a:prstGeom prst="rect">
                       <a:avLst/>
@@ -283,37 +284,11 @@
           <w:lang w:val="en-US"/>
         </w:rPr>
       </w:pPr>
+    </w:p>
+    <w:p>
       <w:r>
         <w:t xml:space="preserve">UML-діаграма дії: </w:t>
       </w:r>
-    </w:p>
-    <w:p>
-      <w:pPr>
-        <w:rPr>
-          <w:lang w:val="en-US"/>
-        </w:rPr>
-      </w:pPr>
-    </w:p>
-    <w:p>
-      <w:pPr>
-        <w:rPr>
-          <w:lang w:val="en-US"/>
-        </w:rPr>
-      </w:pPr>
-    </w:p>
-    <w:p>
-      <w:pPr>
-        <w:rPr>
-          <w:lang w:val="en-US"/>
-        </w:rPr>
-      </w:pPr>
-    </w:p>
-    <w:p>
-      <w:pPr>
-        <w:rPr>
-          <w:lang w:val="en-US"/>
-        </w:rPr>
-      </w:pPr>
     </w:p>
     <w:p>
       <w:pPr>
@@ -326,11 +301,12 @@
           <w:noProof/>
           <w:lang w:val="ru-RU" w:eastAsia="ru-RU"/>
         </w:rPr>
+        <w:lastRenderedPageBreak/>
         <w:drawing>
-          <wp:inline distT="0" distB="0" distL="0" distR="0" wp14:anchorId="248F3326" wp14:editId="306B4D38">
-            <wp:extent cx="5973561" cy="8175672"/>
-            <wp:effectExtent l="0" t="0" r="8255" b="0"/>
-            <wp:docPr id="1869089513" name="Рисунок 1" descr="Зображення, що містить знімок екрана, схема, текст&#10;&#10;Вміст на основі ШІ може бути неправильним."/>
+          <wp:inline distT="0" distB="0" distL="0" distR="0" wp14:anchorId="74284DB0" wp14:editId="49393D6B">
+            <wp:extent cx="4427855" cy="9611995"/>
+            <wp:effectExtent l="0" t="0" r="0" b="8255"/>
+            <wp:docPr id="1228874717" name="Рисунок 3" descr="Зображення, що містить знімок екрана, чорний, Графіка, дизайн&#10;&#10;Вміст на основі ШІ може бути неправильним."/>
             <wp:cNvGraphicFramePr>
               <a:graphicFrameLocks xmlns:a="http://schemas.openxmlformats.org/drawingml/2006/main" noChangeAspect="1"/>
             </wp:cNvGraphicFramePr>
@@ -338,11 +314,17 @@
               <a:graphicData uri="http://schemas.openxmlformats.org/drawingml/2006/picture">
                 <pic:pic xmlns:pic="http://schemas.openxmlformats.org/drawingml/2006/picture">
                   <pic:nvPicPr>
-                    <pic:cNvPr id="1869089513" name="Рисунок 1" descr="Зображення, що містить знімок екрана, схема, текст&#10;&#10;Вміст на основі ШІ може бути неправильним."/>
+                    <pic:cNvPr id="1228874717" name="Рисунок 3" descr="Зображення, що містить знімок екрана, чорний, Графіка, дизайн&#10;&#10;Вміст на основі ШІ може бути неправильним."/>
                     <pic:cNvPicPr/>
                   </pic:nvPicPr>
                   <pic:blipFill>
-                    <a:blip r:embed="rId7"/>
+                    <a:blip r:embed="rId7">
+                      <a:extLst>
+                        <a:ext uri="{28A0092B-C50C-407E-A947-70E740481C1C}">
+                          <a14:useLocalDpi xmlns:a14="http://schemas.microsoft.com/office/drawing/2010/main" val="0"/>
+                        </a:ext>
+                      </a:extLst>
+                    </a:blip>
                     <a:stretch>
                       <a:fillRect/>
                     </a:stretch>
@@ -350,7 +332,7 @@
                   <pic:spPr>
                     <a:xfrm>
                       <a:off x="0" y="0"/>
-                      <a:ext cx="5978697" cy="8182701"/>
+                      <a:ext cx="4427855" cy="9611995"/>
                     </a:xfrm>
                     <a:prstGeom prst="rect">
                       <a:avLst/>
@@ -364,6 +346,43 @@
       </w:r>
     </w:p>
     <w:p>
+      <w:pPr>
+        <w:rPr>
+          <w:lang w:val="en-US"/>
+        </w:rPr>
+      </w:pPr>
+    </w:p>
+    <w:p>
+      <w:pPr>
+        <w:rPr>
+          <w:lang w:val="en-US"/>
+        </w:rPr>
+      </w:pPr>
+    </w:p>
+    <w:p>
+      <w:pPr>
+        <w:rPr>
+          <w:lang w:val="en-US"/>
+        </w:rPr>
+      </w:pPr>
+    </w:p>
+    <w:p>
+      <w:pPr>
+        <w:rPr>
+          <w:lang w:val="en-US"/>
+        </w:rPr>
+      </w:pPr>
+    </w:p>
+    <w:p>
+      <w:pPr>
+        <w:rPr>
+          <w:lang w:val="en-US"/>
+        </w:rPr>
+      </w:pPr>
+      <w:bookmarkStart w:id="0" w:name="_GoBack"/>
+      <w:bookmarkEnd w:id="0"/>
+    </w:p>
+    <w:p>
       <w:r>
         <w:t xml:space="preserve"> Текст програми: </w:t>
       </w:r>
@@ -376,7 +395,966 @@
           <w:szCs w:val="20"/>
         </w:rPr>
       </w:pPr>
-      <w:bookmarkStart w:id="0" w:name="_GoBack"/>
+      <w:r>
+        <w:rPr>
+          <w:rFonts w:ascii="Consolas" w:hAnsi="Consolas"/>
+          <w:sz w:val="20"/>
+          <w:szCs w:val="20"/>
+        </w:rPr>
+        <w:t xml:space="preserve">// Lab_04_5.cpp </w:t>
+      </w:r>
+    </w:p>
+    <w:p>
+      <w:pPr>
+        <w:rPr>
+          <w:rFonts w:ascii="Consolas" w:hAnsi="Consolas"/>
+          <w:sz w:val="20"/>
+          <w:szCs w:val="20"/>
+        </w:rPr>
+      </w:pPr>
+      <w:r>
+        <w:rPr>
+          <w:rFonts w:ascii="Consolas" w:hAnsi="Consolas"/>
+          <w:sz w:val="20"/>
+          <w:szCs w:val="20"/>
+        </w:rPr>
+        <w:t xml:space="preserve">// </w:t>
+      </w:r>
+      <w:r>
+        <w:rPr>
+          <w:rFonts w:ascii="Consolas" w:hAnsi="Consolas"/>
+          <w:sz w:val="20"/>
+          <w:szCs w:val="20"/>
+        </w:rPr>
+        <w:t>Слободянюк Влада Ігорівна</w:t>
+      </w:r>
+    </w:p>
+    <w:p>
+      <w:pPr>
+        <w:rPr>
+          <w:rFonts w:ascii="Consolas" w:hAnsi="Consolas"/>
+          <w:sz w:val="20"/>
+          <w:szCs w:val="20"/>
+        </w:rPr>
+      </w:pPr>
+      <w:r>
+        <w:rPr>
+          <w:rFonts w:ascii="Consolas" w:hAnsi="Consolas"/>
+          <w:sz w:val="20"/>
+          <w:szCs w:val="20"/>
+        </w:rPr>
+        <w:t xml:space="preserve">// Лабораторна робота № 4.5 </w:t>
+      </w:r>
+    </w:p>
+    <w:p>
+      <w:pPr>
+        <w:rPr>
+          <w:rFonts w:ascii="Consolas" w:hAnsi="Consolas"/>
+          <w:sz w:val="20"/>
+          <w:szCs w:val="20"/>
+        </w:rPr>
+      </w:pPr>
+      <w:r>
+        <w:rPr>
+          <w:rFonts w:ascii="Consolas" w:hAnsi="Consolas"/>
+          <w:sz w:val="20"/>
+          <w:szCs w:val="20"/>
+        </w:rPr>
+        <w:t xml:space="preserve">// «Попадання» у плоску фігуру  </w:t>
+      </w:r>
+    </w:p>
+    <w:p>
+      <w:pPr>
+        <w:rPr>
+          <w:rFonts w:ascii="Consolas" w:hAnsi="Consolas"/>
+          <w:sz w:val="20"/>
+          <w:szCs w:val="20"/>
+        </w:rPr>
+      </w:pPr>
+      <w:r>
+        <w:rPr>
+          <w:rFonts w:ascii="Consolas" w:hAnsi="Consolas"/>
+          <w:sz w:val="20"/>
+          <w:szCs w:val="20"/>
+        </w:rPr>
+        <w:t>// Варіант 2</w:t>
+      </w:r>
+      <w:r>
+        <w:rPr>
+          <w:rFonts w:ascii="Consolas" w:hAnsi="Consolas"/>
+          <w:sz w:val="20"/>
+          <w:szCs w:val="20"/>
+        </w:rPr>
+        <w:t>2</w:t>
+      </w:r>
+      <w:r>
+        <w:rPr>
+          <w:rFonts w:ascii="Consolas" w:hAnsi="Consolas"/>
+          <w:sz w:val="20"/>
+          <w:szCs w:val="20"/>
+        </w:rPr>
+        <w:t xml:space="preserve"> </w:t>
+      </w:r>
+    </w:p>
+    <w:p>
+      <w:pPr>
+        <w:rPr>
+          <w:rFonts w:ascii="Consolas" w:hAnsi="Consolas"/>
+          <w:sz w:val="20"/>
+          <w:szCs w:val="20"/>
+        </w:rPr>
+      </w:pPr>
+    </w:p>
+    <w:p>
+      <w:pPr>
+        <w:rPr>
+          <w:rFonts w:ascii="Consolas" w:hAnsi="Consolas"/>
+          <w:sz w:val="20"/>
+          <w:szCs w:val="20"/>
+        </w:rPr>
+      </w:pPr>
+      <w:r>
+        <w:rPr>
+          <w:rFonts w:ascii="Consolas" w:hAnsi="Consolas"/>
+          <w:sz w:val="20"/>
+          <w:szCs w:val="20"/>
+        </w:rPr>
+        <w:t>#</w:t>
+      </w:r>
+      <w:proofErr w:type="spellStart"/>
+      <w:r>
+        <w:rPr>
+          <w:rFonts w:ascii="Consolas" w:hAnsi="Consolas"/>
+          <w:sz w:val="20"/>
+          <w:szCs w:val="20"/>
+        </w:rPr>
+        <w:t>include</w:t>
+      </w:r>
+      <w:proofErr w:type="spellEnd"/>
+      <w:r>
+        <w:rPr>
+          <w:rFonts w:ascii="Consolas" w:hAnsi="Consolas"/>
+          <w:sz w:val="20"/>
+          <w:szCs w:val="20"/>
+        </w:rPr>
+        <w:t xml:space="preserve"> &lt;</w:t>
+      </w:r>
+      <w:proofErr w:type="spellStart"/>
+      <w:r>
+        <w:rPr>
+          <w:rFonts w:ascii="Consolas" w:hAnsi="Consolas"/>
+          <w:sz w:val="20"/>
+          <w:szCs w:val="20"/>
+        </w:rPr>
+        <w:t>iomanip</w:t>
+      </w:r>
+      <w:proofErr w:type="spellEnd"/>
+      <w:r>
+        <w:rPr>
+          <w:rFonts w:ascii="Consolas" w:hAnsi="Consolas"/>
+          <w:sz w:val="20"/>
+          <w:szCs w:val="20"/>
+        </w:rPr>
+        <w:t>&gt;</w:t>
+      </w:r>
+    </w:p>
+    <w:p>
+      <w:pPr>
+        <w:rPr>
+          <w:rFonts w:ascii="Consolas" w:hAnsi="Consolas"/>
+          <w:sz w:val="20"/>
+          <w:szCs w:val="20"/>
+        </w:rPr>
+      </w:pPr>
+      <w:r>
+        <w:rPr>
+          <w:rFonts w:ascii="Consolas" w:hAnsi="Consolas"/>
+          <w:sz w:val="20"/>
+          <w:szCs w:val="20"/>
+        </w:rPr>
+        <w:t>#</w:t>
+      </w:r>
+      <w:proofErr w:type="spellStart"/>
+      <w:r>
+        <w:rPr>
+          <w:rFonts w:ascii="Consolas" w:hAnsi="Consolas"/>
+          <w:sz w:val="20"/>
+          <w:szCs w:val="20"/>
+        </w:rPr>
+        <w:t>include</w:t>
+      </w:r>
+      <w:proofErr w:type="spellEnd"/>
+      <w:r>
+        <w:rPr>
+          <w:rFonts w:ascii="Consolas" w:hAnsi="Consolas"/>
+          <w:sz w:val="20"/>
+          <w:szCs w:val="20"/>
+        </w:rPr>
+        <w:t xml:space="preserve"> &lt;</w:t>
+      </w:r>
+      <w:proofErr w:type="spellStart"/>
+      <w:r>
+        <w:rPr>
+          <w:rFonts w:ascii="Consolas" w:hAnsi="Consolas"/>
+          <w:sz w:val="20"/>
+          <w:szCs w:val="20"/>
+        </w:rPr>
+        <w:t>time.h</w:t>
+      </w:r>
+      <w:proofErr w:type="spellEnd"/>
+      <w:r>
+        <w:rPr>
+          <w:rFonts w:ascii="Consolas" w:hAnsi="Consolas"/>
+          <w:sz w:val="20"/>
+          <w:szCs w:val="20"/>
+        </w:rPr>
+        <w:t>&gt;</w:t>
+      </w:r>
+    </w:p>
+    <w:p>
+      <w:pPr>
+        <w:rPr>
+          <w:rFonts w:ascii="Consolas" w:hAnsi="Consolas"/>
+          <w:sz w:val="20"/>
+          <w:szCs w:val="20"/>
+        </w:rPr>
+      </w:pPr>
+      <w:r>
+        <w:rPr>
+          <w:rFonts w:ascii="Consolas" w:hAnsi="Consolas"/>
+          <w:sz w:val="20"/>
+          <w:szCs w:val="20"/>
+        </w:rPr>
+        <w:t>#</w:t>
+      </w:r>
+      <w:proofErr w:type="spellStart"/>
+      <w:r>
+        <w:rPr>
+          <w:rFonts w:ascii="Consolas" w:hAnsi="Consolas"/>
+          <w:sz w:val="20"/>
+          <w:szCs w:val="20"/>
+        </w:rPr>
+        <w:t>include</w:t>
+      </w:r>
+      <w:proofErr w:type="spellEnd"/>
+      <w:r>
+        <w:rPr>
+          <w:rFonts w:ascii="Consolas" w:hAnsi="Consolas"/>
+          <w:sz w:val="20"/>
+          <w:szCs w:val="20"/>
+        </w:rPr>
+        <w:t xml:space="preserve"> &lt;</w:t>
+      </w:r>
+      <w:proofErr w:type="spellStart"/>
+      <w:r>
+        <w:rPr>
+          <w:rFonts w:ascii="Consolas" w:hAnsi="Consolas"/>
+          <w:sz w:val="20"/>
+          <w:szCs w:val="20"/>
+        </w:rPr>
+        <w:t>iostream</w:t>
+      </w:r>
+      <w:proofErr w:type="spellEnd"/>
+      <w:r>
+        <w:rPr>
+          <w:rFonts w:ascii="Consolas" w:hAnsi="Consolas"/>
+          <w:sz w:val="20"/>
+          <w:szCs w:val="20"/>
+        </w:rPr>
+        <w:t xml:space="preserve">&gt; </w:t>
+      </w:r>
+    </w:p>
+    <w:p>
+      <w:pPr>
+        <w:rPr>
+          <w:rFonts w:ascii="Consolas" w:hAnsi="Consolas"/>
+          <w:sz w:val="20"/>
+          <w:szCs w:val="20"/>
+        </w:rPr>
+      </w:pPr>
+    </w:p>
+    <w:p>
+      <w:pPr>
+        <w:rPr>
+          <w:rFonts w:ascii="Consolas" w:hAnsi="Consolas"/>
+          <w:sz w:val="20"/>
+          <w:szCs w:val="20"/>
+        </w:rPr>
+      </w:pPr>
+      <w:proofErr w:type="spellStart"/>
+      <w:r>
+        <w:rPr>
+          <w:rFonts w:ascii="Consolas" w:hAnsi="Consolas"/>
+          <w:sz w:val="20"/>
+          <w:szCs w:val="20"/>
+        </w:rPr>
+        <w:t>using</w:t>
+      </w:r>
+      <w:proofErr w:type="spellEnd"/>
+      <w:r>
+        <w:rPr>
+          <w:rFonts w:ascii="Consolas" w:hAnsi="Consolas"/>
+          <w:sz w:val="20"/>
+          <w:szCs w:val="20"/>
+        </w:rPr>
+        <w:t xml:space="preserve"> </w:t>
+      </w:r>
+      <w:proofErr w:type="spellStart"/>
+      <w:r>
+        <w:rPr>
+          <w:rFonts w:ascii="Consolas" w:hAnsi="Consolas"/>
+          <w:sz w:val="20"/>
+          <w:szCs w:val="20"/>
+        </w:rPr>
+        <w:t>namespace</w:t>
+      </w:r>
+      <w:proofErr w:type="spellEnd"/>
+      <w:r>
+        <w:rPr>
+          <w:rFonts w:ascii="Consolas" w:hAnsi="Consolas"/>
+          <w:sz w:val="20"/>
+          <w:szCs w:val="20"/>
+        </w:rPr>
+        <w:t xml:space="preserve"> </w:t>
+      </w:r>
+      <w:proofErr w:type="spellStart"/>
+      <w:r>
+        <w:rPr>
+          <w:rFonts w:ascii="Consolas" w:hAnsi="Consolas"/>
+          <w:sz w:val="20"/>
+          <w:szCs w:val="20"/>
+        </w:rPr>
+        <w:t>std</w:t>
+      </w:r>
+      <w:proofErr w:type="spellEnd"/>
+      <w:r>
+        <w:rPr>
+          <w:rFonts w:ascii="Consolas" w:hAnsi="Consolas"/>
+          <w:sz w:val="20"/>
+          <w:szCs w:val="20"/>
+        </w:rPr>
+        <w:t>;</w:t>
+      </w:r>
+    </w:p>
+    <w:p>
+      <w:pPr>
+        <w:rPr>
+          <w:rFonts w:ascii="Consolas" w:hAnsi="Consolas"/>
+          <w:sz w:val="20"/>
+          <w:szCs w:val="20"/>
+        </w:rPr>
+      </w:pPr>
+    </w:p>
+    <w:p>
+      <w:pPr>
+        <w:rPr>
+          <w:rFonts w:ascii="Consolas" w:hAnsi="Consolas"/>
+          <w:sz w:val="20"/>
+          <w:szCs w:val="20"/>
+        </w:rPr>
+      </w:pPr>
+      <w:proofErr w:type="spellStart"/>
+      <w:r>
+        <w:rPr>
+          <w:rFonts w:ascii="Consolas" w:hAnsi="Consolas"/>
+          <w:sz w:val="20"/>
+          <w:szCs w:val="20"/>
+        </w:rPr>
+        <w:t>int</w:t>
+      </w:r>
+      <w:proofErr w:type="spellEnd"/>
+      <w:r>
+        <w:rPr>
+          <w:rFonts w:ascii="Consolas" w:hAnsi="Consolas"/>
+          <w:sz w:val="20"/>
+          <w:szCs w:val="20"/>
+        </w:rPr>
+        <w:t xml:space="preserve"> </w:t>
+      </w:r>
+      <w:proofErr w:type="spellStart"/>
+      <w:r>
+        <w:rPr>
+          <w:rFonts w:ascii="Consolas" w:hAnsi="Consolas"/>
+          <w:sz w:val="20"/>
+          <w:szCs w:val="20"/>
+        </w:rPr>
+        <w:t>main</w:t>
+      </w:r>
+      <w:proofErr w:type="spellEnd"/>
+      <w:r>
+        <w:rPr>
+          <w:rFonts w:ascii="Consolas" w:hAnsi="Consolas"/>
+          <w:sz w:val="20"/>
+          <w:szCs w:val="20"/>
+        </w:rPr>
+        <w:t>()</w:t>
+      </w:r>
+    </w:p>
+    <w:p>
+      <w:pPr>
+        <w:rPr>
+          <w:rFonts w:ascii="Consolas" w:hAnsi="Consolas"/>
+          <w:sz w:val="20"/>
+          <w:szCs w:val="20"/>
+        </w:rPr>
+      </w:pPr>
+      <w:r>
+        <w:rPr>
+          <w:rFonts w:ascii="Consolas" w:hAnsi="Consolas"/>
+          <w:sz w:val="20"/>
+          <w:szCs w:val="20"/>
+        </w:rPr>
+        <w:t>{</w:t>
+      </w:r>
+    </w:p>
+    <w:p>
+      <w:pPr>
+        <w:rPr>
+          <w:rFonts w:ascii="Consolas" w:hAnsi="Consolas"/>
+          <w:sz w:val="20"/>
+          <w:szCs w:val="20"/>
+        </w:rPr>
+      </w:pPr>
+      <w:r>
+        <w:rPr>
+          <w:rFonts w:ascii="Consolas" w:hAnsi="Consolas"/>
+          <w:sz w:val="20"/>
+          <w:szCs w:val="20"/>
+        </w:rPr>
+        <w:tab/>
+      </w:r>
+      <w:proofErr w:type="spellStart"/>
+      <w:r>
+        <w:rPr>
+          <w:rFonts w:ascii="Consolas" w:hAnsi="Consolas"/>
+          <w:sz w:val="20"/>
+          <w:szCs w:val="20"/>
+        </w:rPr>
+        <w:t>double</w:t>
+      </w:r>
+      <w:proofErr w:type="spellEnd"/>
+      <w:r>
+        <w:rPr>
+          <w:rFonts w:ascii="Consolas" w:hAnsi="Consolas"/>
+          <w:sz w:val="20"/>
+          <w:szCs w:val="20"/>
+        </w:rPr>
+        <w:t xml:space="preserve"> x;  </w:t>
+      </w:r>
+    </w:p>
+    <w:p>
+      <w:pPr>
+        <w:rPr>
+          <w:rFonts w:ascii="Consolas" w:hAnsi="Consolas"/>
+          <w:sz w:val="20"/>
+          <w:szCs w:val="20"/>
+        </w:rPr>
+      </w:pPr>
+      <w:r>
+        <w:rPr>
+          <w:rFonts w:ascii="Consolas" w:hAnsi="Consolas"/>
+          <w:sz w:val="20"/>
+          <w:szCs w:val="20"/>
+        </w:rPr>
+        <w:tab/>
+      </w:r>
+      <w:proofErr w:type="spellStart"/>
+      <w:r>
+        <w:rPr>
+          <w:rFonts w:ascii="Consolas" w:hAnsi="Consolas"/>
+          <w:sz w:val="20"/>
+          <w:szCs w:val="20"/>
+        </w:rPr>
+        <w:t>double</w:t>
+      </w:r>
+      <w:proofErr w:type="spellEnd"/>
+      <w:r>
+        <w:rPr>
+          <w:rFonts w:ascii="Consolas" w:hAnsi="Consolas"/>
+          <w:sz w:val="20"/>
+          <w:szCs w:val="20"/>
+        </w:rPr>
+        <w:t xml:space="preserve"> y;  </w:t>
+      </w:r>
+    </w:p>
+    <w:p>
+      <w:pPr>
+        <w:rPr>
+          <w:rFonts w:ascii="Consolas" w:hAnsi="Consolas"/>
+          <w:sz w:val="20"/>
+          <w:szCs w:val="20"/>
+        </w:rPr>
+      </w:pPr>
+      <w:r>
+        <w:rPr>
+          <w:rFonts w:ascii="Consolas" w:hAnsi="Consolas"/>
+          <w:sz w:val="20"/>
+          <w:szCs w:val="20"/>
+        </w:rPr>
+        <w:tab/>
+      </w:r>
+      <w:proofErr w:type="spellStart"/>
+      <w:r>
+        <w:rPr>
+          <w:rFonts w:ascii="Consolas" w:hAnsi="Consolas"/>
+          <w:sz w:val="20"/>
+          <w:szCs w:val="20"/>
+        </w:rPr>
+        <w:t>double</w:t>
+      </w:r>
+      <w:proofErr w:type="spellEnd"/>
+      <w:r>
+        <w:rPr>
+          <w:rFonts w:ascii="Consolas" w:hAnsi="Consolas"/>
+          <w:sz w:val="20"/>
+          <w:szCs w:val="20"/>
+        </w:rPr>
+        <w:t xml:space="preserve"> R;  </w:t>
+      </w:r>
+    </w:p>
+    <w:p>
+      <w:pPr>
+        <w:rPr>
+          <w:rFonts w:ascii="Consolas" w:hAnsi="Consolas"/>
+          <w:sz w:val="20"/>
+          <w:szCs w:val="20"/>
+        </w:rPr>
+      </w:pPr>
+      <w:r>
+        <w:rPr>
+          <w:rFonts w:ascii="Consolas" w:hAnsi="Consolas"/>
+          <w:sz w:val="20"/>
+          <w:szCs w:val="20"/>
+        </w:rPr>
+        <w:tab/>
+      </w:r>
+    </w:p>
+    <w:p>
+      <w:pPr>
+        <w:rPr>
+          <w:rFonts w:ascii="Consolas" w:hAnsi="Consolas"/>
+          <w:sz w:val="20"/>
+          <w:szCs w:val="20"/>
+        </w:rPr>
+      </w:pPr>
+      <w:r>
+        <w:rPr>
+          <w:rFonts w:ascii="Consolas" w:hAnsi="Consolas"/>
+          <w:sz w:val="20"/>
+          <w:szCs w:val="20"/>
+        </w:rPr>
+        <w:tab/>
+      </w:r>
+      <w:proofErr w:type="spellStart"/>
+      <w:r>
+        <w:rPr>
+          <w:rFonts w:ascii="Consolas" w:hAnsi="Consolas"/>
+          <w:sz w:val="20"/>
+          <w:szCs w:val="20"/>
+        </w:rPr>
+        <w:t>cout</w:t>
+      </w:r>
+      <w:proofErr w:type="spellEnd"/>
+      <w:r>
+        <w:rPr>
+          <w:rFonts w:ascii="Consolas" w:hAnsi="Consolas"/>
+          <w:sz w:val="20"/>
+          <w:szCs w:val="20"/>
+        </w:rPr>
+        <w:t xml:space="preserve"> &lt;&lt; "R = "; </w:t>
+      </w:r>
+      <w:proofErr w:type="spellStart"/>
+      <w:r>
+        <w:rPr>
+          <w:rFonts w:ascii="Consolas" w:hAnsi="Consolas"/>
+          <w:sz w:val="20"/>
+          <w:szCs w:val="20"/>
+        </w:rPr>
+        <w:t>cin</w:t>
+      </w:r>
+      <w:proofErr w:type="spellEnd"/>
+      <w:r>
+        <w:rPr>
+          <w:rFonts w:ascii="Consolas" w:hAnsi="Consolas"/>
+          <w:sz w:val="20"/>
+          <w:szCs w:val="20"/>
+        </w:rPr>
+        <w:t xml:space="preserve"> &gt;&gt; R;</w:t>
+      </w:r>
+    </w:p>
+    <w:p>
+      <w:pPr>
+        <w:rPr>
+          <w:rFonts w:ascii="Consolas" w:hAnsi="Consolas"/>
+          <w:sz w:val="20"/>
+          <w:szCs w:val="20"/>
+        </w:rPr>
+      </w:pPr>
+    </w:p>
+    <w:p>
+      <w:pPr>
+        <w:rPr>
+          <w:rFonts w:ascii="Consolas" w:hAnsi="Consolas"/>
+          <w:sz w:val="20"/>
+          <w:szCs w:val="20"/>
+        </w:rPr>
+      </w:pPr>
+      <w:r>
+        <w:rPr>
+          <w:rFonts w:ascii="Consolas" w:hAnsi="Consolas"/>
+          <w:sz w:val="20"/>
+          <w:szCs w:val="20"/>
+        </w:rPr>
+        <w:tab/>
+      </w:r>
+      <w:proofErr w:type="spellStart"/>
+      <w:r>
+        <w:rPr>
+          <w:rFonts w:ascii="Consolas" w:hAnsi="Consolas"/>
+          <w:sz w:val="20"/>
+          <w:szCs w:val="20"/>
+        </w:rPr>
+        <w:t>for</w:t>
+      </w:r>
+      <w:proofErr w:type="spellEnd"/>
+      <w:r>
+        <w:rPr>
+          <w:rFonts w:ascii="Consolas" w:hAnsi="Consolas"/>
+          <w:sz w:val="20"/>
+          <w:szCs w:val="20"/>
+        </w:rPr>
+        <w:t xml:space="preserve"> (</w:t>
+      </w:r>
+      <w:proofErr w:type="spellStart"/>
+      <w:r>
+        <w:rPr>
+          <w:rFonts w:ascii="Consolas" w:hAnsi="Consolas"/>
+          <w:sz w:val="20"/>
+          <w:szCs w:val="20"/>
+        </w:rPr>
+        <w:t>int</w:t>
+      </w:r>
+      <w:proofErr w:type="spellEnd"/>
+      <w:r>
+        <w:rPr>
+          <w:rFonts w:ascii="Consolas" w:hAnsi="Consolas"/>
+          <w:sz w:val="20"/>
+          <w:szCs w:val="20"/>
+        </w:rPr>
+        <w:t xml:space="preserve"> i = 0; i &lt; 10; i++)</w:t>
+      </w:r>
+    </w:p>
+    <w:p>
+      <w:pPr>
+        <w:rPr>
+          <w:rFonts w:ascii="Consolas" w:hAnsi="Consolas"/>
+          <w:sz w:val="20"/>
+          <w:szCs w:val="20"/>
+        </w:rPr>
+      </w:pPr>
+      <w:r>
+        <w:rPr>
+          <w:rFonts w:ascii="Consolas" w:hAnsi="Consolas"/>
+          <w:sz w:val="20"/>
+          <w:szCs w:val="20"/>
+        </w:rPr>
+        <w:tab/>
+        <w:t>{</w:t>
+      </w:r>
+    </w:p>
+    <w:p>
+      <w:pPr>
+        <w:rPr>
+          <w:rFonts w:ascii="Consolas" w:hAnsi="Consolas"/>
+          <w:sz w:val="20"/>
+          <w:szCs w:val="20"/>
+        </w:rPr>
+      </w:pPr>
+      <w:r>
+        <w:rPr>
+          <w:rFonts w:ascii="Consolas" w:hAnsi="Consolas"/>
+          <w:sz w:val="20"/>
+          <w:szCs w:val="20"/>
+        </w:rPr>
+        <w:tab/>
+      </w:r>
+      <w:r>
+        <w:rPr>
+          <w:rFonts w:ascii="Consolas" w:hAnsi="Consolas"/>
+          <w:sz w:val="20"/>
+          <w:szCs w:val="20"/>
+        </w:rPr>
+        <w:tab/>
+        <w:t xml:space="preserve">x = 2 * R * 1.0 * </w:t>
+      </w:r>
+      <w:proofErr w:type="spellStart"/>
+      <w:r>
+        <w:rPr>
+          <w:rFonts w:ascii="Consolas" w:hAnsi="Consolas"/>
+          <w:sz w:val="20"/>
+          <w:szCs w:val="20"/>
+        </w:rPr>
+        <w:t>rand</w:t>
+      </w:r>
+      <w:proofErr w:type="spellEnd"/>
+      <w:r>
+        <w:rPr>
+          <w:rFonts w:ascii="Consolas" w:hAnsi="Consolas"/>
+          <w:sz w:val="20"/>
+          <w:szCs w:val="20"/>
+        </w:rPr>
+        <w:t>() / RAND_MAX - R;</w:t>
+      </w:r>
+    </w:p>
+    <w:p>
+      <w:pPr>
+        <w:rPr>
+          <w:rFonts w:ascii="Consolas" w:hAnsi="Consolas"/>
+          <w:sz w:val="20"/>
+          <w:szCs w:val="20"/>
+        </w:rPr>
+      </w:pPr>
+      <w:r>
+        <w:rPr>
+          <w:rFonts w:ascii="Consolas" w:hAnsi="Consolas"/>
+          <w:sz w:val="20"/>
+          <w:szCs w:val="20"/>
+        </w:rPr>
+        <w:tab/>
+      </w:r>
+      <w:r>
+        <w:rPr>
+          <w:rFonts w:ascii="Consolas" w:hAnsi="Consolas"/>
+          <w:sz w:val="20"/>
+          <w:szCs w:val="20"/>
+        </w:rPr>
+        <w:tab/>
+        <w:t xml:space="preserve">y = 2 * R * 1.0 * </w:t>
+      </w:r>
+      <w:proofErr w:type="spellStart"/>
+      <w:r>
+        <w:rPr>
+          <w:rFonts w:ascii="Consolas" w:hAnsi="Consolas"/>
+          <w:sz w:val="20"/>
+          <w:szCs w:val="20"/>
+        </w:rPr>
+        <w:t>rand</w:t>
+      </w:r>
+      <w:proofErr w:type="spellEnd"/>
+      <w:r>
+        <w:rPr>
+          <w:rFonts w:ascii="Consolas" w:hAnsi="Consolas"/>
+          <w:sz w:val="20"/>
+          <w:szCs w:val="20"/>
+        </w:rPr>
+        <w:t>() / RAND_MAX - R;</w:t>
+      </w:r>
+    </w:p>
+    <w:p>
+      <w:pPr>
+        <w:rPr>
+          <w:rFonts w:ascii="Consolas" w:hAnsi="Consolas"/>
+          <w:sz w:val="20"/>
+          <w:szCs w:val="20"/>
+        </w:rPr>
+      </w:pPr>
+      <w:r>
+        <w:rPr>
+          <w:rFonts w:ascii="Consolas" w:hAnsi="Consolas"/>
+          <w:sz w:val="20"/>
+          <w:szCs w:val="20"/>
+        </w:rPr>
+        <w:tab/>
+      </w:r>
+      <w:r>
+        <w:rPr>
+          <w:rFonts w:ascii="Consolas" w:hAnsi="Consolas"/>
+          <w:sz w:val="20"/>
+          <w:szCs w:val="20"/>
+        </w:rPr>
+        <w:tab/>
+      </w:r>
+      <w:proofErr w:type="spellStart"/>
+      <w:r>
+        <w:rPr>
+          <w:rFonts w:ascii="Consolas" w:hAnsi="Consolas"/>
+          <w:sz w:val="20"/>
+          <w:szCs w:val="20"/>
+        </w:rPr>
+        <w:t>if</w:t>
+      </w:r>
+      <w:proofErr w:type="spellEnd"/>
+      <w:r>
+        <w:rPr>
+          <w:rFonts w:ascii="Consolas" w:hAnsi="Consolas"/>
+          <w:sz w:val="20"/>
+          <w:szCs w:val="20"/>
+        </w:rPr>
+        <w:t xml:space="preserve"> ((0 &gt; x &amp;&amp; x &gt; -R &amp;&amp; R &gt; y &amp;&amp; y &gt; 0 &amp;&amp; R * R &gt;= x * x + y * y) ||</w:t>
+      </w:r>
+    </w:p>
+    <w:p>
+      <w:pPr>
+        <w:rPr>
+          <w:rFonts w:ascii="Consolas" w:hAnsi="Consolas"/>
+          <w:sz w:val="20"/>
+          <w:szCs w:val="20"/>
+        </w:rPr>
+      </w:pPr>
+      <w:r>
+        <w:rPr>
+          <w:rFonts w:ascii="Consolas" w:hAnsi="Consolas"/>
+          <w:sz w:val="20"/>
+          <w:szCs w:val="20"/>
+        </w:rPr>
+        <w:tab/>
+      </w:r>
+      <w:r>
+        <w:rPr>
+          <w:rFonts w:ascii="Consolas" w:hAnsi="Consolas"/>
+          <w:sz w:val="20"/>
+          <w:szCs w:val="20"/>
+        </w:rPr>
+        <w:tab/>
+      </w:r>
+      <w:r>
+        <w:rPr>
+          <w:rFonts w:ascii="Consolas" w:hAnsi="Consolas"/>
+          <w:sz w:val="20"/>
+          <w:szCs w:val="20"/>
+        </w:rPr>
+        <w:tab/>
+        <w:t>(x &gt;= 0 &amp;&amp; y &lt;= 0 &amp;&amp; y &gt;= -2 * x &amp;&amp; y &gt;= 2 * x - 2 * R &amp;&amp; x &lt;= R))</w:t>
+      </w:r>
+    </w:p>
+    <w:p>
+      <w:pPr>
+        <w:rPr>
+          <w:rFonts w:ascii="Consolas" w:hAnsi="Consolas"/>
+          <w:sz w:val="20"/>
+          <w:szCs w:val="20"/>
+        </w:rPr>
+      </w:pPr>
+      <w:r>
+        <w:rPr>
+          <w:rFonts w:ascii="Consolas" w:hAnsi="Consolas"/>
+          <w:sz w:val="20"/>
+          <w:szCs w:val="20"/>
+        </w:rPr>
+        <w:tab/>
+      </w:r>
+      <w:r>
+        <w:rPr>
+          <w:rFonts w:ascii="Consolas" w:hAnsi="Consolas"/>
+          <w:sz w:val="20"/>
+          <w:szCs w:val="20"/>
+        </w:rPr>
+        <w:tab/>
+      </w:r>
+      <w:r>
+        <w:rPr>
+          <w:rFonts w:ascii="Consolas" w:hAnsi="Consolas"/>
+          <w:sz w:val="20"/>
+          <w:szCs w:val="20"/>
+        </w:rPr>
+        <w:tab/>
+      </w:r>
+    </w:p>
+    <w:p>
+      <w:pPr>
+        <w:rPr>
+          <w:rFonts w:ascii="Consolas" w:hAnsi="Consolas"/>
+          <w:sz w:val="20"/>
+          <w:szCs w:val="20"/>
+        </w:rPr>
+      </w:pPr>
+      <w:r>
+        <w:rPr>
+          <w:rFonts w:ascii="Consolas" w:hAnsi="Consolas"/>
+          <w:sz w:val="20"/>
+          <w:szCs w:val="20"/>
+        </w:rPr>
+        <w:tab/>
+      </w:r>
+      <w:r>
+        <w:rPr>
+          <w:rFonts w:ascii="Consolas" w:hAnsi="Consolas"/>
+          <w:sz w:val="20"/>
+          <w:szCs w:val="20"/>
+        </w:rPr>
+        <w:tab/>
+      </w:r>
+      <w:r>
+        <w:rPr>
+          <w:rFonts w:ascii="Consolas" w:hAnsi="Consolas"/>
+          <w:sz w:val="20"/>
+          <w:szCs w:val="20"/>
+        </w:rPr>
+        <w:tab/>
+      </w:r>
+      <w:proofErr w:type="spellStart"/>
+      <w:r>
+        <w:rPr>
+          <w:rFonts w:ascii="Consolas" w:hAnsi="Consolas"/>
+          <w:sz w:val="20"/>
+          <w:szCs w:val="20"/>
+        </w:rPr>
+        <w:t>cout</w:t>
+      </w:r>
+      <w:proofErr w:type="spellEnd"/>
+      <w:r>
+        <w:rPr>
+          <w:rFonts w:ascii="Consolas" w:hAnsi="Consolas"/>
+          <w:sz w:val="20"/>
+          <w:szCs w:val="20"/>
+        </w:rPr>
+        <w:t xml:space="preserve"> &lt;&lt; </w:t>
+      </w:r>
+      <w:proofErr w:type="spellStart"/>
+      <w:r>
+        <w:rPr>
+          <w:rFonts w:ascii="Consolas" w:hAnsi="Consolas"/>
+          <w:sz w:val="20"/>
+          <w:szCs w:val="20"/>
+        </w:rPr>
+        <w:t>setw</w:t>
+      </w:r>
+      <w:proofErr w:type="spellEnd"/>
+      <w:r>
+        <w:rPr>
+          <w:rFonts w:ascii="Consolas" w:hAnsi="Consolas"/>
+          <w:sz w:val="20"/>
+          <w:szCs w:val="20"/>
+        </w:rPr>
+        <w:t xml:space="preserve">(8) &lt;&lt; </w:t>
+      </w:r>
+      <w:proofErr w:type="spellStart"/>
+      <w:r>
+        <w:rPr>
+          <w:rFonts w:ascii="Consolas" w:hAnsi="Consolas"/>
+          <w:sz w:val="20"/>
+          <w:szCs w:val="20"/>
+        </w:rPr>
+        <w:t>setprecision</w:t>
+      </w:r>
+      <w:proofErr w:type="spellEnd"/>
+      <w:r>
+        <w:rPr>
+          <w:rFonts w:ascii="Consolas" w:hAnsi="Consolas"/>
+          <w:sz w:val="20"/>
+          <w:szCs w:val="20"/>
+        </w:rPr>
+        <w:t>(4) &lt;&lt; x &lt;&lt; "  "</w:t>
+      </w:r>
+    </w:p>
+    <w:p>
+      <w:pPr>
+        <w:rPr>
+          <w:rFonts w:ascii="Consolas" w:hAnsi="Consolas"/>
+          <w:sz w:val="20"/>
+          <w:szCs w:val="20"/>
+        </w:rPr>
+      </w:pPr>
       <w:r>
         <w:rPr>
           <w:rFonts w:ascii="Consolas" w:hAnsi="Consolas"/>
@@ -384,330 +1362,87 @@
           <w:szCs w:val="20"/>
         </w:rPr>
         <w:lastRenderedPageBreak/>
-        <w:t xml:space="preserve">// Lab_04_5.cpp </w:t>
-      </w:r>
-    </w:p>
-    <w:p>
-      <w:pPr>
-        <w:rPr>
-          <w:rFonts w:ascii="Consolas" w:hAnsi="Consolas"/>
-          <w:sz w:val="20"/>
-          <w:szCs w:val="20"/>
-        </w:rPr>
-      </w:pPr>
-      <w:r>
-        <w:rPr>
-          <w:rFonts w:ascii="Consolas" w:hAnsi="Consolas"/>
-          <w:sz w:val="20"/>
-          <w:szCs w:val="20"/>
-        </w:rPr>
-        <w:t xml:space="preserve">// </w:t>
-      </w:r>
-      <w:r>
-        <w:rPr>
-          <w:rFonts w:ascii="Consolas" w:hAnsi="Consolas"/>
-          <w:sz w:val="20"/>
-          <w:szCs w:val="20"/>
-        </w:rPr>
-        <w:t>Слободянюк Влада Ігорівна</w:t>
-      </w:r>
-    </w:p>
-    <w:p>
-      <w:pPr>
-        <w:rPr>
-          <w:rFonts w:ascii="Consolas" w:hAnsi="Consolas"/>
-          <w:sz w:val="20"/>
-          <w:szCs w:val="20"/>
-        </w:rPr>
-      </w:pPr>
-      <w:r>
-        <w:rPr>
-          <w:rFonts w:ascii="Consolas" w:hAnsi="Consolas"/>
-          <w:sz w:val="20"/>
-          <w:szCs w:val="20"/>
-        </w:rPr>
-        <w:t xml:space="preserve">// Лабораторна робота № 4.5 </w:t>
-      </w:r>
-    </w:p>
-    <w:p>
-      <w:pPr>
-        <w:rPr>
-          <w:rFonts w:ascii="Consolas" w:hAnsi="Consolas"/>
-          <w:sz w:val="20"/>
-          <w:szCs w:val="20"/>
-        </w:rPr>
-      </w:pPr>
-      <w:r>
-        <w:rPr>
-          <w:rFonts w:ascii="Consolas" w:hAnsi="Consolas"/>
-          <w:sz w:val="20"/>
-          <w:szCs w:val="20"/>
-        </w:rPr>
-        <w:t xml:space="preserve">// «Попадання» у плоску фігуру  </w:t>
-      </w:r>
-    </w:p>
-    <w:p>
-      <w:pPr>
-        <w:rPr>
-          <w:rFonts w:ascii="Consolas" w:hAnsi="Consolas"/>
-          <w:sz w:val="20"/>
-          <w:szCs w:val="20"/>
-        </w:rPr>
-      </w:pPr>
-      <w:r>
-        <w:rPr>
-          <w:rFonts w:ascii="Consolas" w:hAnsi="Consolas"/>
-          <w:sz w:val="20"/>
-          <w:szCs w:val="20"/>
-        </w:rPr>
-        <w:t>// Варіант 2</w:t>
-      </w:r>
-      <w:r>
-        <w:rPr>
-          <w:rFonts w:ascii="Consolas" w:hAnsi="Consolas"/>
-          <w:sz w:val="20"/>
-          <w:szCs w:val="20"/>
-        </w:rPr>
-        <w:t>2</w:t>
-      </w:r>
-      <w:r>
-        <w:rPr>
-          <w:rFonts w:ascii="Consolas" w:hAnsi="Consolas"/>
-          <w:sz w:val="20"/>
-          <w:szCs w:val="20"/>
-        </w:rPr>
-        <w:t xml:space="preserve"> </w:t>
-      </w:r>
-    </w:p>
-    <w:p>
-      <w:pPr>
-        <w:rPr>
-          <w:rFonts w:ascii="Consolas" w:hAnsi="Consolas"/>
-          <w:sz w:val="20"/>
-          <w:szCs w:val="20"/>
-        </w:rPr>
-      </w:pPr>
-    </w:p>
-    <w:p>
-      <w:pPr>
-        <w:rPr>
-          <w:rFonts w:ascii="Consolas" w:hAnsi="Consolas"/>
-          <w:sz w:val="20"/>
-          <w:szCs w:val="20"/>
-        </w:rPr>
-      </w:pPr>
-      <w:r>
-        <w:rPr>
-          <w:rFonts w:ascii="Consolas" w:hAnsi="Consolas"/>
-          <w:sz w:val="20"/>
-          <w:szCs w:val="20"/>
-        </w:rPr>
-        <w:t>#</w:t>
-      </w:r>
-      <w:proofErr w:type="spellStart"/>
-      <w:r>
-        <w:rPr>
-          <w:rFonts w:ascii="Consolas" w:hAnsi="Consolas"/>
-          <w:sz w:val="20"/>
-          <w:szCs w:val="20"/>
-        </w:rPr>
-        <w:t>include</w:t>
-      </w:r>
-      <w:proofErr w:type="spellEnd"/>
-      <w:r>
-        <w:rPr>
-          <w:rFonts w:ascii="Consolas" w:hAnsi="Consolas"/>
-          <w:sz w:val="20"/>
-          <w:szCs w:val="20"/>
-        </w:rPr>
-        <w:t xml:space="preserve"> &lt;</w:t>
-      </w:r>
-      <w:proofErr w:type="spellStart"/>
-      <w:r>
-        <w:rPr>
-          <w:rFonts w:ascii="Consolas" w:hAnsi="Consolas"/>
-          <w:sz w:val="20"/>
-          <w:szCs w:val="20"/>
-        </w:rPr>
-        <w:t>iomanip</w:t>
-      </w:r>
-      <w:proofErr w:type="spellEnd"/>
-      <w:r>
-        <w:rPr>
-          <w:rFonts w:ascii="Consolas" w:hAnsi="Consolas"/>
-          <w:sz w:val="20"/>
-          <w:szCs w:val="20"/>
-        </w:rPr>
-        <w:t>&gt;</w:t>
-      </w:r>
-    </w:p>
-    <w:p>
-      <w:pPr>
-        <w:rPr>
-          <w:rFonts w:ascii="Consolas" w:hAnsi="Consolas"/>
-          <w:sz w:val="20"/>
-          <w:szCs w:val="20"/>
-        </w:rPr>
-      </w:pPr>
-      <w:r>
-        <w:rPr>
-          <w:rFonts w:ascii="Consolas" w:hAnsi="Consolas"/>
-          <w:sz w:val="20"/>
-          <w:szCs w:val="20"/>
-        </w:rPr>
-        <w:t>#</w:t>
-      </w:r>
-      <w:proofErr w:type="spellStart"/>
-      <w:r>
-        <w:rPr>
-          <w:rFonts w:ascii="Consolas" w:hAnsi="Consolas"/>
-          <w:sz w:val="20"/>
-          <w:szCs w:val="20"/>
-        </w:rPr>
-        <w:t>include</w:t>
-      </w:r>
-      <w:proofErr w:type="spellEnd"/>
-      <w:r>
-        <w:rPr>
-          <w:rFonts w:ascii="Consolas" w:hAnsi="Consolas"/>
-          <w:sz w:val="20"/>
-          <w:szCs w:val="20"/>
-        </w:rPr>
-        <w:t xml:space="preserve"> &lt;</w:t>
-      </w:r>
-      <w:proofErr w:type="spellStart"/>
-      <w:r>
-        <w:rPr>
-          <w:rFonts w:ascii="Consolas" w:hAnsi="Consolas"/>
-          <w:sz w:val="20"/>
-          <w:szCs w:val="20"/>
-        </w:rPr>
-        <w:t>time.h</w:t>
-      </w:r>
-      <w:proofErr w:type="spellEnd"/>
-      <w:r>
-        <w:rPr>
-          <w:rFonts w:ascii="Consolas" w:hAnsi="Consolas"/>
-          <w:sz w:val="20"/>
-          <w:szCs w:val="20"/>
-        </w:rPr>
-        <w:t>&gt;</w:t>
-      </w:r>
-    </w:p>
-    <w:p>
-      <w:pPr>
-        <w:rPr>
-          <w:rFonts w:ascii="Consolas" w:hAnsi="Consolas"/>
-          <w:sz w:val="20"/>
-          <w:szCs w:val="20"/>
-        </w:rPr>
-      </w:pPr>
-      <w:r>
-        <w:rPr>
-          <w:rFonts w:ascii="Consolas" w:hAnsi="Consolas"/>
-          <w:sz w:val="20"/>
-          <w:szCs w:val="20"/>
-        </w:rPr>
-        <w:t>#</w:t>
-      </w:r>
-      <w:proofErr w:type="spellStart"/>
-      <w:r>
-        <w:rPr>
-          <w:rFonts w:ascii="Consolas" w:hAnsi="Consolas"/>
-          <w:sz w:val="20"/>
-          <w:szCs w:val="20"/>
-        </w:rPr>
-        <w:t>include</w:t>
-      </w:r>
-      <w:proofErr w:type="spellEnd"/>
-      <w:r>
-        <w:rPr>
-          <w:rFonts w:ascii="Consolas" w:hAnsi="Consolas"/>
-          <w:sz w:val="20"/>
-          <w:szCs w:val="20"/>
-        </w:rPr>
-        <w:t xml:space="preserve"> &lt;</w:t>
-      </w:r>
-      <w:proofErr w:type="spellStart"/>
-      <w:r>
-        <w:rPr>
-          <w:rFonts w:ascii="Consolas" w:hAnsi="Consolas"/>
-          <w:sz w:val="20"/>
-          <w:szCs w:val="20"/>
-        </w:rPr>
-        <w:t>iostream</w:t>
-      </w:r>
-      <w:proofErr w:type="spellEnd"/>
-      <w:r>
-        <w:rPr>
-          <w:rFonts w:ascii="Consolas" w:hAnsi="Consolas"/>
-          <w:sz w:val="20"/>
-          <w:szCs w:val="20"/>
-        </w:rPr>
-        <w:t xml:space="preserve">&gt; </w:t>
-      </w:r>
-    </w:p>
-    <w:p>
-      <w:pPr>
-        <w:rPr>
-          <w:rFonts w:ascii="Consolas" w:hAnsi="Consolas"/>
-          <w:sz w:val="20"/>
-          <w:szCs w:val="20"/>
-        </w:rPr>
-      </w:pPr>
-    </w:p>
-    <w:p>
-      <w:pPr>
-        <w:rPr>
-          <w:rFonts w:ascii="Consolas" w:hAnsi="Consolas"/>
-          <w:sz w:val="20"/>
-          <w:szCs w:val="20"/>
-        </w:rPr>
-      </w:pPr>
-      <w:proofErr w:type="spellStart"/>
-      <w:r>
-        <w:rPr>
-          <w:rFonts w:ascii="Consolas" w:hAnsi="Consolas"/>
-          <w:sz w:val="20"/>
-          <w:szCs w:val="20"/>
-        </w:rPr>
-        <w:t>using</w:t>
-      </w:r>
-      <w:proofErr w:type="spellEnd"/>
-      <w:r>
-        <w:rPr>
-          <w:rFonts w:ascii="Consolas" w:hAnsi="Consolas"/>
-          <w:sz w:val="20"/>
-          <w:szCs w:val="20"/>
-        </w:rPr>
-        <w:t xml:space="preserve"> </w:t>
-      </w:r>
-      <w:proofErr w:type="spellStart"/>
-      <w:r>
-        <w:rPr>
-          <w:rFonts w:ascii="Consolas" w:hAnsi="Consolas"/>
-          <w:sz w:val="20"/>
-          <w:szCs w:val="20"/>
-        </w:rPr>
-        <w:t>namespace</w:t>
-      </w:r>
-      <w:proofErr w:type="spellEnd"/>
-      <w:r>
-        <w:rPr>
-          <w:rFonts w:ascii="Consolas" w:hAnsi="Consolas"/>
-          <w:sz w:val="20"/>
-          <w:szCs w:val="20"/>
-        </w:rPr>
-        <w:t xml:space="preserve"> </w:t>
-      </w:r>
-      <w:proofErr w:type="spellStart"/>
-      <w:r>
-        <w:rPr>
-          <w:rFonts w:ascii="Consolas" w:hAnsi="Consolas"/>
-          <w:sz w:val="20"/>
-          <w:szCs w:val="20"/>
-        </w:rPr>
-        <w:t>std</w:t>
+        <w:tab/>
+      </w:r>
+      <w:r>
+        <w:rPr>
+          <w:rFonts w:ascii="Consolas" w:hAnsi="Consolas"/>
+          <w:sz w:val="20"/>
+          <w:szCs w:val="20"/>
+        </w:rPr>
+        <w:tab/>
+      </w:r>
+      <w:r>
+        <w:rPr>
+          <w:rFonts w:ascii="Consolas" w:hAnsi="Consolas"/>
+          <w:sz w:val="20"/>
+          <w:szCs w:val="20"/>
+        </w:rPr>
+        <w:tab/>
+        <w:t xml:space="preserve">&lt;&lt; </w:t>
+      </w:r>
+      <w:proofErr w:type="spellStart"/>
+      <w:r>
+        <w:rPr>
+          <w:rFonts w:ascii="Consolas" w:hAnsi="Consolas"/>
+          <w:sz w:val="20"/>
+          <w:szCs w:val="20"/>
+        </w:rPr>
+        <w:t>setw</w:t>
+      </w:r>
+      <w:proofErr w:type="spellEnd"/>
+      <w:r>
+        <w:rPr>
+          <w:rFonts w:ascii="Consolas" w:hAnsi="Consolas"/>
+          <w:sz w:val="20"/>
+          <w:szCs w:val="20"/>
+        </w:rPr>
+        <w:t xml:space="preserve">(8) &lt;&lt; </w:t>
+      </w:r>
+      <w:proofErr w:type="spellStart"/>
+      <w:r>
+        <w:rPr>
+          <w:rFonts w:ascii="Consolas" w:hAnsi="Consolas"/>
+          <w:sz w:val="20"/>
+          <w:szCs w:val="20"/>
+        </w:rPr>
+        <w:t>setprecision</w:t>
+      </w:r>
+      <w:proofErr w:type="spellEnd"/>
+      <w:r>
+        <w:rPr>
+          <w:rFonts w:ascii="Consolas" w:hAnsi="Consolas"/>
+          <w:sz w:val="20"/>
+          <w:szCs w:val="20"/>
+        </w:rPr>
+        <w:t>(4) &lt;&lt; y &lt;&lt; "  " &lt;&lt; "</w:t>
+      </w:r>
+      <w:proofErr w:type="spellStart"/>
+      <w:r>
+        <w:rPr>
+          <w:rFonts w:ascii="Consolas" w:hAnsi="Consolas"/>
+          <w:sz w:val="20"/>
+          <w:szCs w:val="20"/>
+        </w:rPr>
+        <w:t>yes</w:t>
+      </w:r>
+      <w:proofErr w:type="spellEnd"/>
+      <w:r>
+        <w:rPr>
+          <w:rFonts w:ascii="Consolas" w:hAnsi="Consolas"/>
+          <w:sz w:val="20"/>
+          <w:szCs w:val="20"/>
+        </w:rPr>
+        <w:t xml:space="preserve">" &lt;&lt; </w:t>
+      </w:r>
+      <w:proofErr w:type="spellStart"/>
+      <w:r>
+        <w:rPr>
+          <w:rFonts w:ascii="Consolas" w:hAnsi="Consolas"/>
+          <w:sz w:val="20"/>
+          <w:szCs w:val="20"/>
+        </w:rPr>
+        <w:t>endl</w:t>
       </w:r>
       <w:proofErr w:type="spellEnd"/>
       <w:r>
@@ -727,199 +1462,90 @@
           <w:szCs w:val="20"/>
         </w:rPr>
       </w:pPr>
-    </w:p>
-    <w:p>
-      <w:pPr>
-        <w:rPr>
-          <w:rFonts w:ascii="Consolas" w:hAnsi="Consolas"/>
-          <w:sz w:val="20"/>
-          <w:szCs w:val="20"/>
-        </w:rPr>
-      </w:pPr>
-      <w:proofErr w:type="spellStart"/>
-      <w:r>
-        <w:rPr>
-          <w:rFonts w:ascii="Consolas" w:hAnsi="Consolas"/>
-          <w:sz w:val="20"/>
-          <w:szCs w:val="20"/>
-        </w:rPr>
-        <w:t>int</w:t>
-      </w:r>
-      <w:proofErr w:type="spellEnd"/>
-      <w:r>
-        <w:rPr>
-          <w:rFonts w:ascii="Consolas" w:hAnsi="Consolas"/>
-          <w:sz w:val="20"/>
-          <w:szCs w:val="20"/>
-        </w:rPr>
-        <w:t xml:space="preserve"> </w:t>
-      </w:r>
-      <w:proofErr w:type="spellStart"/>
-      <w:r>
-        <w:rPr>
-          <w:rFonts w:ascii="Consolas" w:hAnsi="Consolas"/>
-          <w:sz w:val="20"/>
-          <w:szCs w:val="20"/>
-        </w:rPr>
-        <w:t>main</w:t>
-      </w:r>
-      <w:proofErr w:type="spellEnd"/>
-      <w:r>
-        <w:rPr>
-          <w:rFonts w:ascii="Consolas" w:hAnsi="Consolas"/>
-          <w:sz w:val="20"/>
-          <w:szCs w:val="20"/>
-        </w:rPr>
-        <w:t>()</w:t>
-      </w:r>
-    </w:p>
-    <w:p>
-      <w:pPr>
-        <w:rPr>
-          <w:rFonts w:ascii="Consolas" w:hAnsi="Consolas"/>
-          <w:sz w:val="20"/>
-          <w:szCs w:val="20"/>
-        </w:rPr>
-      </w:pPr>
-      <w:r>
-        <w:rPr>
-          <w:rFonts w:ascii="Consolas" w:hAnsi="Consolas"/>
-          <w:sz w:val="20"/>
-          <w:szCs w:val="20"/>
-        </w:rPr>
-        <w:t>{</w:t>
-      </w:r>
-    </w:p>
-    <w:p>
-      <w:pPr>
-        <w:rPr>
-          <w:rFonts w:ascii="Consolas" w:hAnsi="Consolas"/>
-          <w:sz w:val="20"/>
-          <w:szCs w:val="20"/>
-        </w:rPr>
-      </w:pPr>
-      <w:r>
-        <w:rPr>
-          <w:rFonts w:ascii="Consolas" w:hAnsi="Consolas"/>
-          <w:sz w:val="20"/>
-          <w:szCs w:val="20"/>
-        </w:rPr>
-        <w:tab/>
-      </w:r>
-      <w:proofErr w:type="spellStart"/>
-      <w:r>
-        <w:rPr>
-          <w:rFonts w:ascii="Consolas" w:hAnsi="Consolas"/>
-          <w:sz w:val="20"/>
-          <w:szCs w:val="20"/>
-        </w:rPr>
-        <w:t>double</w:t>
-      </w:r>
-      <w:proofErr w:type="spellEnd"/>
-      <w:r>
-        <w:rPr>
-          <w:rFonts w:ascii="Consolas" w:hAnsi="Consolas"/>
-          <w:sz w:val="20"/>
-          <w:szCs w:val="20"/>
-        </w:rPr>
-        <w:t xml:space="preserve"> x;  </w:t>
-      </w:r>
-    </w:p>
-    <w:p>
-      <w:pPr>
-        <w:rPr>
-          <w:rFonts w:ascii="Consolas" w:hAnsi="Consolas"/>
-          <w:sz w:val="20"/>
-          <w:szCs w:val="20"/>
-        </w:rPr>
-      </w:pPr>
-      <w:r>
-        <w:rPr>
-          <w:rFonts w:ascii="Consolas" w:hAnsi="Consolas"/>
-          <w:sz w:val="20"/>
-          <w:szCs w:val="20"/>
-        </w:rPr>
-        <w:tab/>
-      </w:r>
-      <w:proofErr w:type="spellStart"/>
-      <w:r>
-        <w:rPr>
-          <w:rFonts w:ascii="Consolas" w:hAnsi="Consolas"/>
-          <w:sz w:val="20"/>
-          <w:szCs w:val="20"/>
-        </w:rPr>
-        <w:t>double</w:t>
-      </w:r>
-      <w:proofErr w:type="spellEnd"/>
-      <w:r>
-        <w:rPr>
-          <w:rFonts w:ascii="Consolas" w:hAnsi="Consolas"/>
-          <w:sz w:val="20"/>
-          <w:szCs w:val="20"/>
-        </w:rPr>
-        <w:t xml:space="preserve"> y;  </w:t>
-      </w:r>
-    </w:p>
-    <w:p>
-      <w:pPr>
-        <w:rPr>
-          <w:rFonts w:ascii="Consolas" w:hAnsi="Consolas"/>
-          <w:sz w:val="20"/>
-          <w:szCs w:val="20"/>
-        </w:rPr>
-      </w:pPr>
-      <w:r>
-        <w:rPr>
-          <w:rFonts w:ascii="Consolas" w:hAnsi="Consolas"/>
-          <w:sz w:val="20"/>
-          <w:szCs w:val="20"/>
-        </w:rPr>
-        <w:tab/>
-      </w:r>
-      <w:proofErr w:type="spellStart"/>
-      <w:r>
-        <w:rPr>
-          <w:rFonts w:ascii="Consolas" w:hAnsi="Consolas"/>
-          <w:sz w:val="20"/>
-          <w:szCs w:val="20"/>
-        </w:rPr>
-        <w:t>double</w:t>
-      </w:r>
-      <w:proofErr w:type="spellEnd"/>
-      <w:r>
-        <w:rPr>
-          <w:rFonts w:ascii="Consolas" w:hAnsi="Consolas"/>
-          <w:sz w:val="20"/>
-          <w:szCs w:val="20"/>
-        </w:rPr>
-        <w:t xml:space="preserve"> R;  </w:t>
-      </w:r>
-    </w:p>
-    <w:p>
-      <w:pPr>
-        <w:rPr>
-          <w:rFonts w:ascii="Consolas" w:hAnsi="Consolas"/>
-          <w:sz w:val="20"/>
-          <w:szCs w:val="20"/>
-        </w:rPr>
-      </w:pPr>
-      <w:r>
-        <w:rPr>
-          <w:rFonts w:ascii="Consolas" w:hAnsi="Consolas"/>
-          <w:sz w:val="20"/>
-          <w:szCs w:val="20"/>
-        </w:rPr>
-        <w:tab/>
-      </w:r>
-    </w:p>
-    <w:p>
-      <w:pPr>
-        <w:rPr>
-          <w:rFonts w:ascii="Consolas" w:hAnsi="Consolas"/>
-          <w:sz w:val="20"/>
-          <w:szCs w:val="20"/>
-        </w:rPr>
-      </w:pPr>
+      <w:r>
+        <w:rPr>
+          <w:rFonts w:ascii="Consolas" w:hAnsi="Consolas"/>
+          <w:sz w:val="20"/>
+          <w:szCs w:val="20"/>
+        </w:rPr>
+        <w:tab/>
+      </w:r>
+      <w:r>
+        <w:rPr>
+          <w:rFonts w:ascii="Consolas" w:hAnsi="Consolas"/>
+          <w:sz w:val="20"/>
+          <w:szCs w:val="20"/>
+        </w:rPr>
+        <w:tab/>
+      </w:r>
+      <w:proofErr w:type="spellStart"/>
+      <w:r>
+        <w:rPr>
+          <w:rFonts w:ascii="Consolas" w:hAnsi="Consolas"/>
+          <w:sz w:val="20"/>
+          <w:szCs w:val="20"/>
+        </w:rPr>
+        <w:t>else</w:t>
+      </w:r>
+      <w:proofErr w:type="spellEnd"/>
+    </w:p>
+    <w:p>
+      <w:pPr>
+        <w:rPr>
+          <w:rFonts w:ascii="Consolas" w:hAnsi="Consolas"/>
+          <w:sz w:val="20"/>
+          <w:szCs w:val="20"/>
+        </w:rPr>
+      </w:pPr>
+      <w:r>
+        <w:rPr>
+          <w:rFonts w:ascii="Consolas" w:hAnsi="Consolas"/>
+          <w:sz w:val="20"/>
+          <w:szCs w:val="20"/>
+        </w:rPr>
+        <w:tab/>
+      </w:r>
+      <w:r>
+        <w:rPr>
+          <w:rFonts w:ascii="Consolas" w:hAnsi="Consolas"/>
+          <w:sz w:val="20"/>
+          <w:szCs w:val="20"/>
+        </w:rPr>
+        <w:tab/>
+      </w:r>
+      <w:r>
+        <w:rPr>
+          <w:rFonts w:ascii="Consolas" w:hAnsi="Consolas"/>
+          <w:sz w:val="20"/>
+          <w:szCs w:val="20"/>
+        </w:rPr>
+        <w:tab/>
+      </w:r>
+    </w:p>
+    <w:p>
+      <w:pPr>
+        <w:rPr>
+          <w:rFonts w:ascii="Consolas" w:hAnsi="Consolas"/>
+          <w:sz w:val="20"/>
+          <w:szCs w:val="20"/>
+        </w:rPr>
+      </w:pPr>
+      <w:r>
+        <w:rPr>
+          <w:rFonts w:ascii="Consolas" w:hAnsi="Consolas"/>
+          <w:sz w:val="20"/>
+          <w:szCs w:val="20"/>
+        </w:rPr>
+        <w:tab/>
+      </w:r>
+      <w:r>
+        <w:rPr>
+          <w:rFonts w:ascii="Consolas" w:hAnsi="Consolas"/>
+          <w:sz w:val="20"/>
+          <w:szCs w:val="20"/>
+        </w:rPr>
+        <w:tab/>
+      </w:r>
       <w:r>
         <w:rPr>
           <w:rFonts w:ascii="Consolas" w:hAnsi="Consolas"/>
@@ -944,353 +1570,6 @@
           <w:sz w:val="20"/>
           <w:szCs w:val="20"/>
         </w:rPr>
-        <w:t xml:space="preserve"> &lt;&lt; "R = "; </w:t>
-      </w:r>
-      <w:proofErr w:type="spellStart"/>
-      <w:r>
-        <w:rPr>
-          <w:rFonts w:ascii="Consolas" w:hAnsi="Consolas"/>
-          <w:sz w:val="20"/>
-          <w:szCs w:val="20"/>
-        </w:rPr>
-        <w:t>cin</w:t>
-      </w:r>
-      <w:proofErr w:type="spellEnd"/>
-      <w:r>
-        <w:rPr>
-          <w:rFonts w:ascii="Consolas" w:hAnsi="Consolas"/>
-          <w:sz w:val="20"/>
-          <w:szCs w:val="20"/>
-        </w:rPr>
-        <w:t xml:space="preserve"> &gt;&gt; R;</w:t>
-      </w:r>
-    </w:p>
-    <w:p>
-      <w:pPr>
-        <w:rPr>
-          <w:rFonts w:ascii="Consolas" w:hAnsi="Consolas"/>
-          <w:sz w:val="20"/>
-          <w:szCs w:val="20"/>
-        </w:rPr>
-      </w:pPr>
-    </w:p>
-    <w:p>
-      <w:pPr>
-        <w:rPr>
-          <w:rFonts w:ascii="Consolas" w:hAnsi="Consolas"/>
-          <w:sz w:val="20"/>
-          <w:szCs w:val="20"/>
-        </w:rPr>
-      </w:pPr>
-      <w:r>
-        <w:rPr>
-          <w:rFonts w:ascii="Consolas" w:hAnsi="Consolas"/>
-          <w:sz w:val="20"/>
-          <w:szCs w:val="20"/>
-        </w:rPr>
-        <w:tab/>
-      </w:r>
-      <w:proofErr w:type="spellStart"/>
-      <w:r>
-        <w:rPr>
-          <w:rFonts w:ascii="Consolas" w:hAnsi="Consolas"/>
-          <w:sz w:val="20"/>
-          <w:szCs w:val="20"/>
-        </w:rPr>
-        <w:t>for</w:t>
-      </w:r>
-      <w:proofErr w:type="spellEnd"/>
-      <w:r>
-        <w:rPr>
-          <w:rFonts w:ascii="Consolas" w:hAnsi="Consolas"/>
-          <w:sz w:val="20"/>
-          <w:szCs w:val="20"/>
-        </w:rPr>
-        <w:t xml:space="preserve"> (</w:t>
-      </w:r>
-      <w:proofErr w:type="spellStart"/>
-      <w:r>
-        <w:rPr>
-          <w:rFonts w:ascii="Consolas" w:hAnsi="Consolas"/>
-          <w:sz w:val="20"/>
-          <w:szCs w:val="20"/>
-        </w:rPr>
-        <w:t>int</w:t>
-      </w:r>
-      <w:proofErr w:type="spellEnd"/>
-      <w:r>
-        <w:rPr>
-          <w:rFonts w:ascii="Consolas" w:hAnsi="Consolas"/>
-          <w:sz w:val="20"/>
-          <w:szCs w:val="20"/>
-        </w:rPr>
-        <w:t xml:space="preserve"> i = 0; i &lt; 10; i++)</w:t>
-      </w:r>
-    </w:p>
-    <w:p>
-      <w:pPr>
-        <w:rPr>
-          <w:rFonts w:ascii="Consolas" w:hAnsi="Consolas"/>
-          <w:sz w:val="20"/>
-          <w:szCs w:val="20"/>
-        </w:rPr>
-      </w:pPr>
-      <w:r>
-        <w:rPr>
-          <w:rFonts w:ascii="Consolas" w:hAnsi="Consolas"/>
-          <w:sz w:val="20"/>
-          <w:szCs w:val="20"/>
-        </w:rPr>
-        <w:tab/>
-        <w:t>{</w:t>
-      </w:r>
-    </w:p>
-    <w:p>
-      <w:pPr>
-        <w:rPr>
-          <w:rFonts w:ascii="Consolas" w:hAnsi="Consolas"/>
-          <w:sz w:val="20"/>
-          <w:szCs w:val="20"/>
-        </w:rPr>
-      </w:pPr>
-      <w:r>
-        <w:rPr>
-          <w:rFonts w:ascii="Consolas" w:hAnsi="Consolas"/>
-          <w:sz w:val="20"/>
-          <w:szCs w:val="20"/>
-        </w:rPr>
-        <w:tab/>
-      </w:r>
-      <w:r>
-        <w:rPr>
-          <w:rFonts w:ascii="Consolas" w:hAnsi="Consolas"/>
-          <w:sz w:val="20"/>
-          <w:szCs w:val="20"/>
-        </w:rPr>
-        <w:tab/>
-        <w:t xml:space="preserve">x = 2 * R * 1.0 * </w:t>
-      </w:r>
-      <w:proofErr w:type="spellStart"/>
-      <w:r>
-        <w:rPr>
-          <w:rFonts w:ascii="Consolas" w:hAnsi="Consolas"/>
-          <w:sz w:val="20"/>
-          <w:szCs w:val="20"/>
-        </w:rPr>
-        <w:t>rand</w:t>
-      </w:r>
-      <w:proofErr w:type="spellEnd"/>
-      <w:r>
-        <w:rPr>
-          <w:rFonts w:ascii="Consolas" w:hAnsi="Consolas"/>
-          <w:sz w:val="20"/>
-          <w:szCs w:val="20"/>
-        </w:rPr>
-        <w:t>() / RAND_MAX - R;</w:t>
-      </w:r>
-    </w:p>
-    <w:p>
-      <w:pPr>
-        <w:rPr>
-          <w:rFonts w:ascii="Consolas" w:hAnsi="Consolas"/>
-          <w:sz w:val="20"/>
-          <w:szCs w:val="20"/>
-        </w:rPr>
-      </w:pPr>
-      <w:r>
-        <w:rPr>
-          <w:rFonts w:ascii="Consolas" w:hAnsi="Consolas"/>
-          <w:sz w:val="20"/>
-          <w:szCs w:val="20"/>
-        </w:rPr>
-        <w:tab/>
-      </w:r>
-      <w:r>
-        <w:rPr>
-          <w:rFonts w:ascii="Consolas" w:hAnsi="Consolas"/>
-          <w:sz w:val="20"/>
-          <w:szCs w:val="20"/>
-        </w:rPr>
-        <w:tab/>
-        <w:t xml:space="preserve">y = 2 * R * 1.0 * </w:t>
-      </w:r>
-      <w:proofErr w:type="spellStart"/>
-      <w:r>
-        <w:rPr>
-          <w:rFonts w:ascii="Consolas" w:hAnsi="Consolas"/>
-          <w:sz w:val="20"/>
-          <w:szCs w:val="20"/>
-        </w:rPr>
-        <w:t>rand</w:t>
-      </w:r>
-      <w:proofErr w:type="spellEnd"/>
-      <w:r>
-        <w:rPr>
-          <w:rFonts w:ascii="Consolas" w:hAnsi="Consolas"/>
-          <w:sz w:val="20"/>
-          <w:szCs w:val="20"/>
-        </w:rPr>
-        <w:t>() / RAND_MAX - R;</w:t>
-      </w:r>
-    </w:p>
-    <w:p>
-      <w:pPr>
-        <w:rPr>
-          <w:rFonts w:ascii="Consolas" w:hAnsi="Consolas"/>
-          <w:sz w:val="20"/>
-          <w:szCs w:val="20"/>
-        </w:rPr>
-      </w:pPr>
-      <w:r>
-        <w:rPr>
-          <w:rFonts w:ascii="Consolas" w:hAnsi="Consolas"/>
-          <w:sz w:val="20"/>
-          <w:szCs w:val="20"/>
-        </w:rPr>
-        <w:tab/>
-      </w:r>
-      <w:r>
-        <w:rPr>
-          <w:rFonts w:ascii="Consolas" w:hAnsi="Consolas"/>
-          <w:sz w:val="20"/>
-          <w:szCs w:val="20"/>
-        </w:rPr>
-        <w:tab/>
-      </w:r>
-      <w:proofErr w:type="spellStart"/>
-      <w:r>
-        <w:rPr>
-          <w:rFonts w:ascii="Consolas" w:hAnsi="Consolas"/>
-          <w:sz w:val="20"/>
-          <w:szCs w:val="20"/>
-        </w:rPr>
-        <w:t>if</w:t>
-      </w:r>
-      <w:proofErr w:type="spellEnd"/>
-      <w:r>
-        <w:rPr>
-          <w:rFonts w:ascii="Consolas" w:hAnsi="Consolas"/>
-          <w:sz w:val="20"/>
-          <w:szCs w:val="20"/>
-        </w:rPr>
-        <w:t xml:space="preserve"> ((0 &gt; x &amp;&amp; x &gt; -R &amp;&amp; R &gt; y &amp;&amp; y &gt; 0 &amp;&amp; R * R &gt;= x * x + y * y) ||</w:t>
-      </w:r>
-    </w:p>
-    <w:p>
-      <w:pPr>
-        <w:rPr>
-          <w:rFonts w:ascii="Consolas" w:hAnsi="Consolas"/>
-          <w:sz w:val="20"/>
-          <w:szCs w:val="20"/>
-        </w:rPr>
-      </w:pPr>
-      <w:r>
-        <w:rPr>
-          <w:rFonts w:ascii="Consolas" w:hAnsi="Consolas"/>
-          <w:sz w:val="20"/>
-          <w:szCs w:val="20"/>
-        </w:rPr>
-        <w:tab/>
-      </w:r>
-      <w:r>
-        <w:rPr>
-          <w:rFonts w:ascii="Consolas" w:hAnsi="Consolas"/>
-          <w:sz w:val="20"/>
-          <w:szCs w:val="20"/>
-        </w:rPr>
-        <w:tab/>
-      </w:r>
-      <w:r>
-        <w:rPr>
-          <w:rFonts w:ascii="Consolas" w:hAnsi="Consolas"/>
-          <w:sz w:val="20"/>
-          <w:szCs w:val="20"/>
-        </w:rPr>
-        <w:tab/>
-        <w:t>(x &gt;= 0 &amp;&amp; y &lt;= 0 &amp;&amp; y &gt;= -2 * x &amp;&amp; y &gt;= 2 * x - 2 * R &amp;&amp; x &lt;= R))</w:t>
-      </w:r>
-    </w:p>
-    <w:p>
-      <w:pPr>
-        <w:rPr>
-          <w:rFonts w:ascii="Consolas" w:hAnsi="Consolas"/>
-          <w:sz w:val="20"/>
-          <w:szCs w:val="20"/>
-        </w:rPr>
-      </w:pPr>
-      <w:r>
-        <w:rPr>
-          <w:rFonts w:ascii="Consolas" w:hAnsi="Consolas"/>
-          <w:sz w:val="20"/>
-          <w:szCs w:val="20"/>
-        </w:rPr>
-        <w:tab/>
-      </w:r>
-      <w:r>
-        <w:rPr>
-          <w:rFonts w:ascii="Consolas" w:hAnsi="Consolas"/>
-          <w:sz w:val="20"/>
-          <w:szCs w:val="20"/>
-        </w:rPr>
-        <w:tab/>
-      </w:r>
-      <w:r>
-        <w:rPr>
-          <w:rFonts w:ascii="Consolas" w:hAnsi="Consolas"/>
-          <w:sz w:val="20"/>
-          <w:szCs w:val="20"/>
-        </w:rPr>
-        <w:tab/>
-      </w:r>
-    </w:p>
-    <w:p>
-      <w:pPr>
-        <w:rPr>
-          <w:rFonts w:ascii="Consolas" w:hAnsi="Consolas"/>
-          <w:sz w:val="20"/>
-          <w:szCs w:val="20"/>
-        </w:rPr>
-      </w:pPr>
-      <w:r>
-        <w:rPr>
-          <w:rFonts w:ascii="Consolas" w:hAnsi="Consolas"/>
-          <w:sz w:val="20"/>
-          <w:szCs w:val="20"/>
-        </w:rPr>
-        <w:tab/>
-      </w:r>
-      <w:r>
-        <w:rPr>
-          <w:rFonts w:ascii="Consolas" w:hAnsi="Consolas"/>
-          <w:sz w:val="20"/>
-          <w:szCs w:val="20"/>
-        </w:rPr>
-        <w:tab/>
-      </w:r>
-      <w:r>
-        <w:rPr>
-          <w:rFonts w:ascii="Consolas" w:hAnsi="Consolas"/>
-          <w:sz w:val="20"/>
-          <w:szCs w:val="20"/>
-        </w:rPr>
-        <w:tab/>
-      </w:r>
-      <w:proofErr w:type="spellStart"/>
-      <w:r>
-        <w:rPr>
-          <w:rFonts w:ascii="Consolas" w:hAnsi="Consolas"/>
-          <w:sz w:val="20"/>
-          <w:szCs w:val="20"/>
-        </w:rPr>
-        <w:t>cout</w:t>
-      </w:r>
-      <w:proofErr w:type="spellEnd"/>
-      <w:r>
-        <w:rPr>
-          <w:rFonts w:ascii="Consolas" w:hAnsi="Consolas"/>
-          <w:sz w:val="20"/>
-          <w:szCs w:val="20"/>
-        </w:rPr>
         <w:t xml:space="preserve"> &lt;&lt; </w:t>
       </w:r>
       <w:proofErr w:type="spellStart"/>
@@ -1406,7 +1685,7 @@
           <w:sz w:val="20"/>
           <w:szCs w:val="20"/>
         </w:rPr>
-        <w:t>yes</w:t>
+        <w:t>no</w:t>
       </w:r>
       <w:proofErr w:type="spellEnd"/>
       <w:r>
@@ -1451,267 +1730,6 @@
           <w:szCs w:val="20"/>
         </w:rPr>
         <w:tab/>
-      </w:r>
-      <w:r>
-        <w:rPr>
-          <w:rFonts w:ascii="Consolas" w:hAnsi="Consolas"/>
-          <w:sz w:val="20"/>
-          <w:szCs w:val="20"/>
-        </w:rPr>
-        <w:tab/>
-      </w:r>
-      <w:proofErr w:type="spellStart"/>
-      <w:r>
-        <w:rPr>
-          <w:rFonts w:ascii="Consolas" w:hAnsi="Consolas"/>
-          <w:sz w:val="20"/>
-          <w:szCs w:val="20"/>
-        </w:rPr>
-        <w:t>else</w:t>
-      </w:r>
-      <w:proofErr w:type="spellEnd"/>
-    </w:p>
-    <w:p>
-      <w:pPr>
-        <w:rPr>
-          <w:rFonts w:ascii="Consolas" w:hAnsi="Consolas"/>
-          <w:sz w:val="20"/>
-          <w:szCs w:val="20"/>
-        </w:rPr>
-      </w:pPr>
-      <w:r>
-        <w:rPr>
-          <w:rFonts w:ascii="Consolas" w:hAnsi="Consolas"/>
-          <w:sz w:val="20"/>
-          <w:szCs w:val="20"/>
-        </w:rPr>
-        <w:tab/>
-      </w:r>
-      <w:r>
-        <w:rPr>
-          <w:rFonts w:ascii="Consolas" w:hAnsi="Consolas"/>
-          <w:sz w:val="20"/>
-          <w:szCs w:val="20"/>
-        </w:rPr>
-        <w:tab/>
-      </w:r>
-      <w:r>
-        <w:rPr>
-          <w:rFonts w:ascii="Consolas" w:hAnsi="Consolas"/>
-          <w:sz w:val="20"/>
-          <w:szCs w:val="20"/>
-        </w:rPr>
-        <w:tab/>
-      </w:r>
-    </w:p>
-    <w:p>
-      <w:pPr>
-        <w:rPr>
-          <w:rFonts w:ascii="Consolas" w:hAnsi="Consolas"/>
-          <w:sz w:val="20"/>
-          <w:szCs w:val="20"/>
-        </w:rPr>
-      </w:pPr>
-      <w:r>
-        <w:rPr>
-          <w:rFonts w:ascii="Consolas" w:hAnsi="Consolas"/>
-          <w:sz w:val="20"/>
-          <w:szCs w:val="20"/>
-        </w:rPr>
-        <w:tab/>
-      </w:r>
-      <w:r>
-        <w:rPr>
-          <w:rFonts w:ascii="Consolas" w:hAnsi="Consolas"/>
-          <w:sz w:val="20"/>
-          <w:szCs w:val="20"/>
-        </w:rPr>
-        <w:tab/>
-      </w:r>
-      <w:r>
-        <w:rPr>
-          <w:rFonts w:ascii="Consolas" w:hAnsi="Consolas"/>
-          <w:sz w:val="20"/>
-          <w:szCs w:val="20"/>
-        </w:rPr>
-        <w:tab/>
-      </w:r>
-      <w:proofErr w:type="spellStart"/>
-      <w:r>
-        <w:rPr>
-          <w:rFonts w:ascii="Consolas" w:hAnsi="Consolas"/>
-          <w:sz w:val="20"/>
-          <w:szCs w:val="20"/>
-        </w:rPr>
-        <w:t>cout</w:t>
-      </w:r>
-      <w:proofErr w:type="spellEnd"/>
-      <w:r>
-        <w:rPr>
-          <w:rFonts w:ascii="Consolas" w:hAnsi="Consolas"/>
-          <w:sz w:val="20"/>
-          <w:szCs w:val="20"/>
-        </w:rPr>
-        <w:t xml:space="preserve"> &lt;&lt; </w:t>
-      </w:r>
-      <w:proofErr w:type="spellStart"/>
-      <w:r>
-        <w:rPr>
-          <w:rFonts w:ascii="Consolas" w:hAnsi="Consolas"/>
-          <w:sz w:val="20"/>
-          <w:szCs w:val="20"/>
-        </w:rPr>
-        <w:t>setw</w:t>
-      </w:r>
-      <w:proofErr w:type="spellEnd"/>
-      <w:r>
-        <w:rPr>
-          <w:rFonts w:ascii="Consolas" w:hAnsi="Consolas"/>
-          <w:sz w:val="20"/>
-          <w:szCs w:val="20"/>
-        </w:rPr>
-        <w:t xml:space="preserve">(8) &lt;&lt; </w:t>
-      </w:r>
-      <w:proofErr w:type="spellStart"/>
-      <w:r>
-        <w:rPr>
-          <w:rFonts w:ascii="Consolas" w:hAnsi="Consolas"/>
-          <w:sz w:val="20"/>
-          <w:szCs w:val="20"/>
-        </w:rPr>
-        <w:t>setprecision</w:t>
-      </w:r>
-      <w:proofErr w:type="spellEnd"/>
-      <w:r>
-        <w:rPr>
-          <w:rFonts w:ascii="Consolas" w:hAnsi="Consolas"/>
-          <w:sz w:val="20"/>
-          <w:szCs w:val="20"/>
-        </w:rPr>
-        <w:t>(4) &lt;&lt; x &lt;&lt; "  "</w:t>
-      </w:r>
-    </w:p>
-    <w:p>
-      <w:pPr>
-        <w:rPr>
-          <w:rFonts w:ascii="Consolas" w:hAnsi="Consolas"/>
-          <w:sz w:val="20"/>
-          <w:szCs w:val="20"/>
-        </w:rPr>
-      </w:pPr>
-      <w:r>
-        <w:rPr>
-          <w:rFonts w:ascii="Consolas" w:hAnsi="Consolas"/>
-          <w:sz w:val="20"/>
-          <w:szCs w:val="20"/>
-        </w:rPr>
-        <w:tab/>
-      </w:r>
-      <w:r>
-        <w:rPr>
-          <w:rFonts w:ascii="Consolas" w:hAnsi="Consolas"/>
-          <w:sz w:val="20"/>
-          <w:szCs w:val="20"/>
-        </w:rPr>
-        <w:tab/>
-      </w:r>
-      <w:r>
-        <w:rPr>
-          <w:rFonts w:ascii="Consolas" w:hAnsi="Consolas"/>
-          <w:sz w:val="20"/>
-          <w:szCs w:val="20"/>
-        </w:rPr>
-        <w:tab/>
-        <w:t xml:space="preserve">&lt;&lt; </w:t>
-      </w:r>
-      <w:proofErr w:type="spellStart"/>
-      <w:r>
-        <w:rPr>
-          <w:rFonts w:ascii="Consolas" w:hAnsi="Consolas"/>
-          <w:sz w:val="20"/>
-          <w:szCs w:val="20"/>
-        </w:rPr>
-        <w:t>setw</w:t>
-      </w:r>
-      <w:proofErr w:type="spellEnd"/>
-      <w:r>
-        <w:rPr>
-          <w:rFonts w:ascii="Consolas" w:hAnsi="Consolas"/>
-          <w:sz w:val="20"/>
-          <w:szCs w:val="20"/>
-        </w:rPr>
-        <w:t xml:space="preserve">(8) &lt;&lt; </w:t>
-      </w:r>
-      <w:proofErr w:type="spellStart"/>
-      <w:r>
-        <w:rPr>
-          <w:rFonts w:ascii="Consolas" w:hAnsi="Consolas"/>
-          <w:sz w:val="20"/>
-          <w:szCs w:val="20"/>
-        </w:rPr>
-        <w:t>setprecision</w:t>
-      </w:r>
-      <w:proofErr w:type="spellEnd"/>
-      <w:r>
-        <w:rPr>
-          <w:rFonts w:ascii="Consolas" w:hAnsi="Consolas"/>
-          <w:sz w:val="20"/>
-          <w:szCs w:val="20"/>
-        </w:rPr>
-        <w:t>(4) &lt;&lt; y &lt;&lt; "  " &lt;&lt; "</w:t>
-      </w:r>
-      <w:proofErr w:type="spellStart"/>
-      <w:r>
-        <w:rPr>
-          <w:rFonts w:ascii="Consolas" w:hAnsi="Consolas"/>
-          <w:sz w:val="20"/>
-          <w:szCs w:val="20"/>
-        </w:rPr>
-        <w:t>no</w:t>
-      </w:r>
-      <w:proofErr w:type="spellEnd"/>
-      <w:r>
-        <w:rPr>
-          <w:rFonts w:ascii="Consolas" w:hAnsi="Consolas"/>
-          <w:sz w:val="20"/>
-          <w:szCs w:val="20"/>
-        </w:rPr>
-        <w:t xml:space="preserve">" &lt;&lt; </w:t>
-      </w:r>
-      <w:proofErr w:type="spellStart"/>
-      <w:r>
-        <w:rPr>
-          <w:rFonts w:ascii="Consolas" w:hAnsi="Consolas"/>
-          <w:sz w:val="20"/>
-          <w:szCs w:val="20"/>
-        </w:rPr>
-        <w:t>endl</w:t>
-      </w:r>
-      <w:proofErr w:type="spellEnd"/>
-      <w:r>
-        <w:rPr>
-          <w:rFonts w:ascii="Consolas" w:hAnsi="Consolas"/>
-          <w:sz w:val="20"/>
-          <w:szCs w:val="20"/>
-        </w:rPr>
-        <w:t>;</w:t>
-      </w:r>
-    </w:p>
-    <w:p>
-      <w:pPr>
-        <w:rPr>
-          <w:rFonts w:ascii="Consolas" w:hAnsi="Consolas"/>
-          <w:sz w:val="20"/>
-          <w:szCs w:val="20"/>
-        </w:rPr>
-      </w:pPr>
-      <w:r>
-        <w:rPr>
-          <w:rFonts w:ascii="Consolas" w:hAnsi="Consolas"/>
-          <w:sz w:val="20"/>
-          <w:szCs w:val="20"/>
-        </w:rPr>
-        <w:tab/>
         <w:t>}</w:t>
       </w:r>
     </w:p>
@@ -1738,7 +1756,6 @@
           <w:sz w:val="20"/>
           <w:szCs w:val="20"/>
         </w:rPr>
-        <w:lastRenderedPageBreak/>
         <w:tab/>
       </w:r>
       <w:proofErr w:type="spellStart"/>
@@ -1811,7 +1828,6 @@
         </w:rPr>
         <w:t>}</w:t>
       </w:r>
-      <w:bookmarkEnd w:id="0"/>
     </w:p>
     <w:p>
       <w:r>
@@ -1827,26 +1843,13 @@
       </w:r>
     </w:p>
     <w:p>
-      <w:hyperlink r:id="rId8" w:history="1">
-        <w:proofErr w:type="spellStart"/>
-        <w:r>
-          <w:rPr>
-            <w:rStyle w:val="ac"/>
-          </w:rPr>
-          <w:t>arsenvynnytskyi</w:t>
-        </w:r>
-        <w:proofErr w:type="spellEnd"/>
-        <w:r>
-          <w:rPr>
-            <w:rStyle w:val="ac"/>
-          </w:rPr>
-          <w:t>/laba4.5</w:t>
-        </w:r>
-      </w:hyperlink>
-    </w:p>
-    <w:p>
-      <w:r>
-        <w:t xml:space="preserve"> Висновки:</w:t>
+      <w:r>
+        <w:t>Висновки:</w:t>
+      </w:r>
+    </w:p>
+    <w:p>
+      <w:r>
+        <w:t>https://github.com/vladaska22/lab_4_5.git</w:t>
       </w:r>
     </w:p>
     <w:p>

</xml_diff>